<commit_message>
Replace em dashes with standard hyphens across curriculum and workbook
</commit_message>
<xml_diff>
--- a/Business_AI_Tools_Student_Worksheets.docx
+++ b/Business_AI_Tools_Student_Worksheets.docx
@@ -819,7 +819,7 @@
                 <w:sz w:val="17"/>
                 <w:rFonts w:ascii="Times New Roman" w:hAnsi="Times New Roman" w:cs="Times New Roman"/>
               </w:rPr>
-              <w:t>EXERCISE 1 (BASIC — CUSTOMER REVIEW RESPONSE SCORECARD)  |  PUBLIC DATA SOURCE: PyCaret Open Amazon Reviews CSV Dataset</w:t>
+              <w:t>EXERCISE 1 (BASIC - CUSTOMER REVIEW RESPONSE SCORECARD)  |  PUBLIC DATA SOURCE: PyCaret Open Amazon Reviews CSV Dataset</w:t>
               <w:br/>
             </w:r>
             <w:r>
@@ -1416,7 +1416,7 @@
                 <w:sz w:val="17"/>
                 <w:rFonts w:ascii="Times New Roman" w:hAnsi="Times New Roman" w:cs="Times New Roman"/>
               </w:rPr>
-              <w:t>EXERCISE 2 (ADVANCED — MULTI-ISSUE ESCALATION &amp; INTERNAL ALERT)  |  PUBLIC DATA SOURCE: PyCaret Open Amazon Reviews CSV Dataset (Exact Same Dataset)</w:t>
+              <w:t>EXERCISE 2 (ADVANCED - MULTI-ISSUE ESCALATION &amp; INTERNAL ALERT)  |  PUBLIC DATA SOURCE: PyCaret Open Amazon Reviews CSV Dataset (Exact Same Dataset)</w:t>
               <w:br/>
             </w:r>
             <w:r>
@@ -1839,7 +1839,7 @@
                 <w:sz w:val="17"/>
                 <w:rFonts w:ascii="Times New Roman" w:hAnsi="Times New Roman" w:cs="Times New Roman"/>
               </w:rPr>
-              <w:t>EXERCISE 1 (BASIC — 4-BOX ARCHITECTURE EXECUTIVE MEMO)  |  PUBLIC DATA SOURCE: PR Newswire Public Business Press Releases</w:t>
+              <w:t>EXERCISE 1 (BASIC - 4-BOX ARCHITECTURE EXECUTIVE MEMO)  |  PUBLIC DATA SOURCE: PR Newswire Public Business Press Releases</w:t>
               <w:br/>
             </w:r>
             <w:r>
@@ -2413,7 +2413,7 @@
                 <w:sz w:val="17"/>
                 <w:rFonts w:ascii="Times New Roman" w:hAnsi="Times New Roman" w:cs="Times New Roman"/>
               </w:rPr>
-              <w:t>EXERCISE 2 (ADVANCED — COMPETITIVE SALES BATTLECARD &amp; OBJECTION HANDLER)  |  PUBLIC DATA SOURCE: PR Newswire Public Business Press Releases (Exact Same Dataset)</w:t>
+              <w:t>EXERCISE 2 (ADVANCED - COMPETITIVE SALES BATTLECARD &amp; OBJECTION HANDLER)  |  PUBLIC DATA SOURCE: PR Newswire Public Business Press Releases (Exact Same Dataset)</w:t>
               <w:br/>
             </w:r>
             <w:r>
@@ -2914,7 +2914,7 @@
                 <w:sz w:val="17"/>
                 <w:rFonts w:ascii="Times New Roman" w:hAnsi="Times New Roman" w:cs="Times New Roman"/>
               </w:rPr>
-              <w:t>EXERCISE 1 (BASIC — 5-CONSTRAINT SUMMARY AUDIT)  |  PUBLIC DATA SOURCE: US Small Business Administration (SBA) Business Guide</w:t>
+              <w:t>EXERCISE 1 (BASIC - 5-CONSTRAINT SUMMARY AUDIT)  |  PUBLIC DATA SOURCE: US Small Business Administration (SBA) Business Guide</w:t>
               <w:br/>
             </w:r>
             <w:r>
@@ -3546,7 +3546,7 @@
                 <w:sz w:val="17"/>
                 <w:rFonts w:ascii="Times New Roman" w:hAnsi="Times New Roman" w:cs="Times New Roman"/>
               </w:rPr>
-              <w:t>EXERCISE 2 (ADVANCED — BIMODAL STAKEHOLDER TONE CALIBRATION)  |  PUBLIC DATA SOURCE: US Small Business Administration (SBA) Business Guide (Exact Same Dataset)</w:t>
+              <w:t>EXERCISE 2 (ADVANCED - BIMODAL STAKEHOLDER TONE CALIBRATION)  |  PUBLIC DATA SOURCE: US Small Business Administration (SBA) Business Guide (Exact Same Dataset)</w:t>
               <w:br/>
             </w:r>
             <w:r>
@@ -3969,7 +3969,7 @@
                 <w:sz w:val="17"/>
                 <w:rFonts w:ascii="Times New Roman" w:hAnsi="Times New Roman" w:cs="Times New Roman"/>
               </w:rPr>
-              <w:t>EXERCISE 1 (BASIC — STEP-BY-STEP ASSUMPTION AUDIT)  |  PUBLIC DATA SOURCE: MIT Sloan Management Ideas Articles</w:t>
+              <w:t>EXERCISE 1 (BASIC - STEP-BY-STEP ASSUMPTION AUDIT)  |  PUBLIC DATA SOURCE: MIT Sloan Management Ideas Articles</w:t>
               <w:br/>
             </w:r>
             <w:r>
@@ -4535,7 +4535,7 @@
                 <w:sz w:val="17"/>
                 <w:rFonts w:ascii="Times New Roman" w:hAnsi="Times New Roman" w:cs="Times New Roman"/>
               </w:rPr>
-              <w:t>EXERCISE 2 (ADVANCED — 12-MONTH PRE-MORTEM FAILURE ANALYSIS)  |  PUBLIC DATA SOURCE: MIT Sloan Management Ideas Articles (Exact Same Dataset)</w:t>
+              <w:t>EXERCISE 2 (ADVANCED - 12-MONTH PRE-MORTEM FAILURE ANALYSIS)  |  PUBLIC DATA SOURCE: MIT Sloan Management Ideas Articles (Exact Same Dataset)</w:t>
               <w:br/>
             </w:r>
             <w:r>
@@ -5034,7 +5034,7 @@
                 <w:sz w:val="17"/>
                 <w:rFonts w:ascii="Times New Roman" w:hAnsi="Times New Roman" w:cs="Times New Roman"/>
               </w:rPr>
-              <w:t>EXERCISE 1 (BASIC — REVENUE SUM &amp; ARITHMETIC AUDIT)  |  PUBLIC DATA SOURCE: Chipotle Restaurant Sales &amp; Orders Dataset (TSV)</w:t>
+              <w:t>EXERCISE 1 (BASIC - REVENUE SUM &amp; ARITHMETIC AUDIT)  |  PUBLIC DATA SOURCE: Chipotle Restaurant Sales &amp; Orders Dataset (TSV)</w:t>
               <w:br/>
             </w:r>
             <w:r>
@@ -5633,7 +5633,7 @@
                 <w:sz w:val="17"/>
                 <w:rFonts w:ascii="Times New Roman" w:hAnsi="Times New Roman" w:cs="Times New Roman"/>
               </w:rPr>
-              <w:t>EXERCISE 2 (ADVANCED — INGREDIENT INFLATION TRADE-OFF MODEL)  |  PUBLIC DATA SOURCE: Chipotle Restaurant Sales &amp; Orders Dataset (TSV) (Exact Same Dataset)</w:t>
+              <w:t>EXERCISE 2 (ADVANCED - INGREDIENT INFLATION TRADE-OFF MODEL)  |  PUBLIC DATA SOURCE: Chipotle Restaurant Sales &amp; Orders Dataset (TSV) (Exact Same Dataset)</w:t>
               <w:br/>
             </w:r>
             <w:r>
@@ -6225,7 +6225,7 @@
                 <w:sz w:val="17"/>
                 <w:rFonts w:ascii="Times New Roman" w:hAnsi="Times New Roman" w:cs="Times New Roman"/>
               </w:rPr>
-              <w:t>EXERCISE 1 (BASIC — CHURN FACTOR &amp; CONTRACT AUDIT)  |  PUBLIC DATA SOURCE: Customer Churn &amp; Service Contract Dataset (CSV)</w:t>
+              <w:t>EXERCISE 1 (BASIC - CHURN FACTOR &amp; CONTRACT AUDIT)  |  PUBLIC DATA SOURCE: Customer Churn &amp; Service Contract Dataset (CSV)</w:t>
               <w:br/>
             </w:r>
             <w:r>
@@ -6647,7 +6647,7 @@
                 <w:sz w:val="17"/>
                 <w:rFonts w:ascii="Times New Roman" w:hAnsi="Times New Roman" w:cs="Times New Roman"/>
               </w:rPr>
-              <w:t>EXERCISE 2 (ADVANCED — HIGH-VALUE CHURN RETENTION ENGINEERING)  |  PUBLIC DATA SOURCE: Customer Churn &amp; Service Contract Dataset (CSV) (Exact Same Dataset)</w:t>
+              <w:t>EXERCISE 2 (ADVANCED - HIGH-VALUE CHURN RETENTION ENGINEERING)  |  PUBLIC DATA SOURCE: Customer Churn &amp; Service Contract Dataset (CSV) (Exact Same Dataset)</w:t>
               <w:br/>
             </w:r>
             <w:r>
@@ -7138,7 +7138,7 @@
                 <w:sz w:val="17"/>
                 <w:rFonts w:ascii="Times New Roman" w:hAnsi="Times New Roman" w:cs="Times New Roman"/>
               </w:rPr>
-              <w:t>EXERCISE 1 (BASIC — KIOSK PROJECT CHARTER GRID)  |  PUBLIC DATA SOURCE: Project Charter Guide &amp; Framework (Wikipedia)</w:t>
+              <w:t>EXERCISE 1 (BASIC - KIOSK PROJECT CHARTER GRID)  |  PUBLIC DATA SOURCE: Project Charter Guide &amp; Framework (Wikipedia)</w:t>
               <w:br/>
             </w:r>
             <w:r>
@@ -7708,7 +7708,7 @@
                 <w:sz w:val="17"/>
                 <w:rFonts w:ascii="Times New Roman" w:hAnsi="Times New Roman" w:cs="Times New Roman"/>
               </w:rPr>
-              <w:t>EXERCISE 2 (ADVANCED — SCOPE CREEP DEFENSE &amp; STAKEHOLDER NEGOTIATION)  |  PUBLIC DATA SOURCE: Project Charter Guide &amp; Framework (Wikipedia) (Exact Same Dataset)</w:t>
+              <w:t>EXERCISE 2 (ADVANCED - SCOPE CREEP DEFENSE &amp; STAKEHOLDER NEGOTIATION)  |  PUBLIC DATA SOURCE: Project Charter Guide &amp; Framework (Wikipedia) (Exact Same Dataset)</w:t>
               <w:br/>
             </w:r>
             <w:r>
@@ -8193,7 +8193,7 @@
                 <w:sz w:val="17"/>
                 <w:rFonts w:ascii="Times New Roman" w:hAnsi="Times New Roman" w:cs="Times New Roman"/>
               </w:rPr>
-              <w:t>EXERCISE 1 (BASIC — CONTRASTING BUYER PERSONAS (JTBD))  |  PUBLIC DATA SOURCE: Pew Research Center Consumer Trends</w:t>
+              <w:t>EXERCISE 1 (BASIC - CONTRASTING BUYER PERSONAS (JTBD))  |  PUBLIC DATA SOURCE: Pew Research Center Consumer Trends</w:t>
               <w:br/>
             </w:r>
             <w:r>
@@ -8606,7 +8606,7 @@
                 <w:sz w:val="16"/>
                 <w:rFonts w:ascii="Times New Roman" w:hAnsi="Times New Roman" w:cs="Times New Roman"/>
               </w:rPr>
-              <w:t>'Never get hit by a surprise overdraft fee again — free for your first 60 days.'</w:t>
+              <w:t>'Never get hit by a surprise overdraft fee again - free for your first 60 days.'</w:t>
             </w:r>
           </w:p>
         </w:tc>
@@ -8757,7 +8757,7 @@
                 <w:sz w:val="17"/>
                 <w:rFonts w:ascii="Times New Roman" w:hAnsi="Times New Roman" w:cs="Times New Roman"/>
               </w:rPr>
-              <w:t>EXERCISE 2 (ADVANCED — OBJECTION HANDLING SIMULATION DIALOGUE)  |  PUBLIC DATA SOURCE: Pew Research Center Consumer Trends (Exact Same Dataset)</w:t>
+              <w:t>EXERCISE 2 (ADVANCED - OBJECTION HANDLING SIMULATION DIALOGUE)  |  PUBLIC DATA SOURCE: Pew Research Center Consumer Trends (Exact Same Dataset)</w:t>
               <w:br/>
             </w:r>
             <w:r>
@@ -9353,7 +9353,7 @@
                 <w:sz w:val="17"/>
                 <w:rFonts w:ascii="Times New Roman" w:hAnsi="Times New Roman" w:cs="Times New Roman"/>
               </w:rPr>
-              <w:t>EXERCISE 1 (BASIC — 2-YEAR FINANCIAL MARGIN AUDIT)  |  PUBLIC DATA SOURCE: Yahoo Finance Apple Inc. (AAPL) Financials</w:t>
+              <w:t>EXERCISE 1 (BASIC - 2-YEAR FINANCIAL MARGIN AUDIT)  |  PUBLIC DATA SOURCE: Yahoo Finance Apple Inc. (AAPL) Financials</w:t>
               <w:br/>
             </w:r>
             <w:r>
@@ -10040,7 +10040,7 @@
                 <w:sz w:val="17"/>
                 <w:rFonts w:ascii="Times New Roman" w:hAnsi="Times New Roman" w:cs="Times New Roman"/>
               </w:rPr>
-              <w:t>EXERCISE 2 (ADVANCED — INFLATION SENSITIVITY &amp; COST ABSORPTION MODEL)  |  PUBLIC DATA SOURCE: Yahoo Finance Apple Inc. (AAPL) Financials (Exact Same Dataset)</w:t>
+              <w:t>EXERCISE 2 (ADVANCED - INFLATION SENSITIVITY &amp; COST ABSORPTION MODEL)  |  PUBLIC DATA SOURCE: Yahoo Finance Apple Inc. (AAPL) Financials (Exact Same Dataset)</w:t>
               <w:br/>
             </w:r>
             <w:r>
@@ -10531,7 +10531,7 @@
                 <w:sz w:val="17"/>
                 <w:rFonts w:ascii="Times New Roman" w:hAnsi="Times New Roman" w:cs="Times New Roman"/>
               </w:rPr>
-              <w:t>EXERCISE 1 (BASIC — 5-WHYS WAREHOUSE DELAY DIAGNOSTIC)  |  PUBLIC DATA SOURCE: Five Whys Root Cause Analysis (Wikipedia)</w:t>
+              <w:t>EXERCISE 1 (BASIC - 5-WHYS WAREHOUSE DELAY DIAGNOSTIC)  |  PUBLIC DATA SOURCE: Five Whys Root Cause Analysis (Wikipedia)</w:t>
               <w:br/>
             </w:r>
             <w:r>
@@ -11312,7 +11312,7 @@
                 <w:sz w:val="17"/>
                 <w:rFonts w:ascii="Times New Roman" w:hAnsi="Times New Roman" w:cs="Times New Roman"/>
               </w:rPr>
-              <w:t>EXERCISE 2 (ADVANCED — CROSS-FUNCTIONAL FMEA RISK ANALYSIS)  |  PUBLIC DATA SOURCE: Five Whys Root Cause Analysis (Wikipedia) (Exact Same Dataset)</w:t>
+              <w:t>EXERCISE 2 (ADVANCED - CROSS-FUNCTIONAL FMEA RISK ANALYSIS)  |  PUBLIC DATA SOURCE: Five Whys Root Cause Analysis (Wikipedia) (Exact Same Dataset)</w:t>
               <w:br/>
             </w:r>
             <w:r>
@@ -11908,7 +11908,7 @@
                 <w:sz w:val="17"/>
                 <w:rFonts w:ascii="Times New Roman" w:hAnsi="Times New Roman" w:cs="Times New Roman"/>
               </w:rPr>
-              <w:t>EXERCISE 1 (BASIC — COMPETENCY JOB ARCHITECTURE &amp; REDLINE)  |  PUBLIC DATA SOURCE: O*NET OnLine Market Research Analyst Profile</w:t>
+              <w:t>EXERCISE 1 (BASIC - COMPETENCY JOB ARCHITECTURE &amp; REDLINE)  |  PUBLIC DATA SOURCE: O*NET OnLine Market Research Analyst Profile</w:t>
               <w:br/>
             </w:r>
             <w:r>
@@ -12394,7 +12394,7 @@
                 <w:sz w:val="17"/>
                 <w:rFonts w:ascii="Times New Roman" w:hAnsi="Times New Roman" w:cs="Times New Roman"/>
               </w:rPr>
-              <w:t>EXERCISE 2 (ADVANCED — STANDARDIZED STAR INTERVIEW SCORING CALIBRATION)  |  PUBLIC DATA SOURCE: O*NET OnLine Market Research Analyst Profile (Exact Same Dataset)</w:t>
+              <w:t>EXERCISE 2 (ADVANCED - STANDARDIZED STAR INTERVIEW SCORING CALIBRATION)  |  PUBLIC DATA SOURCE: O*NET OnLine Market Research Analyst Profile (Exact Same Dataset)</w:t>
               <w:br/>
             </w:r>
             <w:r>
@@ -12813,7 +12813,7 @@
                 <w:sz w:val="17"/>
                 <w:rFonts w:ascii="Times New Roman" w:hAnsi="Times New Roman" w:cs="Times New Roman"/>
               </w:rPr>
-              <w:t>EXERCISE 1 (BASIC — PII TOKENIZATION &amp; SANITIZATION AUDIT)  |  PUBLIC DATA SOURCE: AI Incident Database (Public Real Incidents)</w:t>
+              <w:t>EXERCISE 1 (BASIC - PII TOKENIZATION &amp; SANITIZATION AUDIT)  |  PUBLIC DATA SOURCE: AI Incident Database (Public Real Incidents)</w:t>
               <w:br/>
             </w:r>
             <w:r>
@@ -13404,7 +13404,7 @@
                 <w:sz w:val="17"/>
                 <w:rFonts w:ascii="Times New Roman" w:hAnsi="Times New Roman" w:cs="Times New Roman"/>
               </w:rPr>
-              <w:t>EXERCISE 2 (ADVANCED — CORPORATE AI BREACH ESCALATION &amp; GOVERNANCE MEMO)  |  PUBLIC DATA SOURCE: AI Incident Database (Public Real Incidents) (Exact Same Dataset)</w:t>
+              <w:t>EXERCISE 2 (ADVANCED - CORPORATE AI BREACH ESCALATION &amp; GOVERNANCE MEMO)  |  PUBLIC DATA SOURCE: AI Incident Database (Public Real Incidents) (Exact Same Dataset)</w:t>
               <w:br/>
             </w:r>
             <w:r>
@@ -13889,7 +13889,7 @@
                 <w:sz w:val="17"/>
                 <w:rFonts w:ascii="Times New Roman" w:hAnsi="Times New Roman" w:cs="Times New Roman"/>
               </w:rPr>
-              <w:t>EXERCISE 1 (BASIC — STANDARDIZED MEETING SOP TEMPLATE)  |  PUBLIC DATA SOURCE: US Federal Reserve FOMC Meeting Minutes</w:t>
+              <w:t>EXERCISE 1 (BASIC - STANDARDIZED MEETING SOP TEMPLATE)  |  PUBLIC DATA SOURCE: US Federal Reserve FOMC Meeting Minutes</w:t>
               <w:br/>
             </w:r>
             <w:r>
@@ -14391,7 +14391,7 @@
                 <w:sz w:val="17"/>
                 <w:rFonts w:ascii="Times New Roman" w:hAnsi="Times New Roman" w:cs="Times New Roman"/>
               </w:rPr>
-              <w:t>EXERCISE 2 (ADVANCED — MULTI-DEPARTMENT BRIEFING DISTRIBUTION SOP)  |  PUBLIC DATA SOURCE: US Federal Reserve FOMC Meeting Minutes (Exact Same Dataset)</w:t>
+              <w:t>EXERCISE 2 (ADVANCED - MULTI-DEPARTMENT BRIEFING DISTRIBUTION SOP)  |  PUBLIC DATA SOURCE: US Federal Reserve FOMC Meeting Minutes (Exact Same Dataset)</w:t>
               <w:br/>
             </w:r>
             <w:r>
@@ -14814,7 +14814,7 @@
                 <w:sz w:val="17"/>
                 <w:rFonts w:ascii="Times New Roman" w:hAnsi="Times New Roman" w:cs="Times New Roman"/>
               </w:rPr>
-              <w:t>EXERCISE 1 (BASIC — DEFENSIVE FALLBACK BUG PATCH)  |  PUBLIC DATA SOURCE: Awesome ChatGPT Prompts (GitHub Public Open Source)</w:t>
+              <w:t>EXERCISE 1 (BASIC - DEFENSIVE FALLBACK BUG PATCH)  |  PUBLIC DATA SOURCE: Awesome ChatGPT Prompts (GitHub Public Open Source)</w:t>
               <w:br/>
             </w:r>
             <w:r>
@@ -15403,7 +15403,7 @@
                 <w:sz w:val="17"/>
                 <w:rFonts w:ascii="Times New Roman" w:hAnsi="Times New Roman" w:cs="Times New Roman"/>
               </w:rPr>
-              <w:t>EXERCISE 2 (ADVANCED — ADVERSARIAL RED-TEAMING STRESS TEST)  |  PUBLIC DATA SOURCE: Awesome ChatGPT Prompts (GitHub Public Open Source) (Exact Same Dataset)</w:t>
+              <w:t>EXERCISE 2 (ADVANCED - ADVERSARIAL RED-TEAMING STRESS TEST)  |  PUBLIC DATA SOURCE: Awesome ChatGPT Prompts (GitHub Public Open Source) (Exact Same Dataset)</w:t>
               <w:br/>
             </w:r>
             <w:r>
@@ -15989,7 +15989,7 @@
                 <w:sz w:val="17"/>
                 <w:rFonts w:ascii="Times New Roman" w:hAnsi="Times New Roman" w:cs="Times New Roman"/>
               </w:rPr>
-              <w:t>EXERCISE 1 (BASIC — MULTI-ATTRIBUTE PROMPT ROI SCORING)  |  PUBLIC DATA SOURCE: Stanford HAI AI Index Report &amp; NBER Working Paper</w:t>
+              <w:t>EXERCISE 1 (BASIC - MULTI-ATTRIBUTE PROMPT ROI SCORING)  |  PUBLIC DATA SOURCE: Stanford HAI AI Index Report &amp; NBER Working Paper</w:t>
               <w:br/>
             </w:r>
             <w:r>
@@ -17055,7 +17055,7 @@
                 <w:sz w:val="17"/>
                 <w:rFonts w:ascii="Times New Roman" w:hAnsi="Times New Roman" w:cs="Times New Roman"/>
               </w:rPr>
-              <w:t>EXERCISE 2 (ADVANCED — ENTERPRISE BUSINESS CASE &amp; DEPLOYMENT PITCH)  |  PUBLIC DATA SOURCE: Stanford HAI AI Index Report &amp; NBER Working Paper (Exact Same Dataset)</w:t>
+              <w:t>EXERCISE 2 (ADVANCED - ENTERPRISE BUSINESS CASE &amp; DEPLOYMENT PITCH)  |  PUBLIC DATA SOURCE: Stanford HAI AI Index Report &amp; NBER Working Paper (Exact Same Dataset)</w:t>
               <w:br/>
             </w:r>
             <w:r>
@@ -17542,7 +17542,7 @@
                 <w:sz w:val="17"/>
                 <w:rFonts w:ascii="Times New Roman" w:hAnsi="Times New Roman" w:cs="Times New Roman"/>
               </w:rPr>
-              <w:t>EXERCISE 1 (BASIC — 5 STANDARDIZED PRODUCTION PROMPT CARDS)  |  PUBLIC DATA SOURCE: OpenAI Official Prompt Guide &amp; McKinsey Rewired</w:t>
+              <w:t>EXERCISE 1 (BASIC - 5 STANDARDIZED PRODUCTION PROMPT CARDS)  |  PUBLIC DATA SOURCE: OpenAI Official Prompt Guide &amp; McKinsey Rewired</w:t>
               <w:br/>
             </w:r>
             <w:r>
@@ -18323,7 +18323,7 @@
                 <w:sz w:val="17"/>
                 <w:rFonts w:ascii="Times New Roman" w:hAnsi="Times New Roman" w:cs="Times New Roman"/>
               </w:rPr>
-              <w:t>EXERCISE 2 (ADVANCED — PORTFOLIO DEFENSE &amp; RECRUITER SIMULATION)  |  PUBLIC DATA SOURCE: OpenAI Official Prompt Guide &amp; McKinsey Rewired (Exact Same Dataset)</w:t>
+              <w:t>EXERCISE 2 (ADVANCED - PORTFOLIO DEFENSE &amp; RECRUITER SIMULATION)  |  PUBLIC DATA SOURCE: OpenAI Official Prompt Guide &amp; McKinsey Rewired (Exact Same Dataset)</w:t>
               <w:br/>
             </w:r>
             <w:r>

</xml_diff>